<commit_message>
v1.1: desktop app, relative temp report, Konva fix, project mgmt
</commit_message>
<xml_diff>
--- a/backend/templates/report.docx
+++ b/backend/templates/report.docx
@@ -12,17 +12,22 @@
     </w:p>
     <w:p>
       <w:r>
-        <w:t>项目名称: {project_name}</w:t>
+        <w:t>项目名称: {{ project_name }}</w:t>
       </w:r>
     </w:p>
     <w:p>
       <w:r>
-        <w:t>报告日期: {report_date}</w:t>
+        <w:t>报告日期: {{ report_date }}</w:t>
       </w:r>
     </w:p>
     <w:p>
       <w:r>
-        <w:t>图片总数: {image_count}</w:t>
+        <w:t>图片总数: {{ image_count }}</w:t>
+      </w:r>
+    </w:p>
+    <w:p>
+      <w:r>
+        <w:t>正常设备温度: {{ normal_temp }}°C</w:t>
       </w:r>
     </w:p>
     <w:p>
@@ -129,6 +134,28 @@
           </w:tcPr>
           <w:p>
             <w:r>
+              <w:t>环境温度 (°C)</w:t>
+            </w:r>
+          </w:p>
+        </w:tc>
+        <w:tc>
+          <w:tcPr>
+            <w:tcW w:type="dxa" w:w="4320"/>
+          </w:tcPr>
+          <w:p>
+            <w:r>
+              <w:t>{{ img.ambient_temp }}</w:t>
+            </w:r>
+          </w:p>
+        </w:tc>
+      </w:tr>
+      <w:tr>
+        <w:tc>
+          <w:tcPr>
+            <w:tcW w:type="dxa" w:w="4320"/>
+          </w:tcPr>
+          <w:p>
+            <w:r>
               <w:t>最高温 (°C)</w:t>
             </w:r>
           </w:p>
@@ -140,6 +167,28 @@
           <w:p>
             <w:r>
               <w:t>{{ img.t_max }}</w:t>
+            </w:r>
+          </w:p>
+        </w:tc>
+      </w:tr>
+      <w:tr>
+        <w:tc>
+          <w:tcPr>
+            <w:tcW w:type="dxa" w:w="4320"/>
+          </w:tcPr>
+          <w:p>
+            <w:r>
+              <w:t>最低温 (°C)</w:t>
+            </w:r>
+          </w:p>
+        </w:tc>
+        <w:tc>
+          <w:tcPr>
+            <w:tcW w:type="dxa" w:w="4320"/>
+          </w:tcPr>
+          <w:p>
+            <w:r>
+              <w:t>{{ img.t_min }}</w:t>
             </w:r>
           </w:p>
         </w:tc>
@@ -167,9 +216,10 @@
         </w:tc>
       </w:tr>
     </w:tbl>
+    <w:p/>
     <w:p>
       <w:r>
-        <w:t>框选标注:</w:t>
+        <w:t>框选标注与分析:</w:t>
       </w:r>
     </w:p>
     <w:p>
@@ -177,19 +227,142 @@
         <w:t>{% for ann in img.annotations %}</w:t>
       </w:r>
     </w:p>
-    <w:p>
-      <w:r>
-        <w:t xml:space="preserve">  框 {{ ann.box }} — 最高温: {{ ann.t_max }}°C, 平均温: {{ ann.t_mean }}°C</w:t>
-      </w:r>
-    </w:p>
+    <w:tbl>
+      <w:tblPr>
+        <w:tblStyle w:val="TableGrid"/>
+        <w:tblW w:type="auto" w:w="0"/>
+        <w:tblLook w:firstColumn="1" w:firstRow="1" w:lastColumn="0" w:lastRow="0" w:noHBand="0" w:noVBand="1" w:val="04A0"/>
+      </w:tblPr>
+      <w:tblGrid>
+        <w:gridCol w:w="4320"/>
+        <w:gridCol w:w="4320"/>
+      </w:tblGrid>
+      <w:tr>
+        <w:tc>
+          <w:tcPr>
+            <w:tcW w:type="dxa" w:w="4320"/>
+          </w:tcPr>
+          <w:p>
+            <w:r>
+              <w:t>框坐标</w:t>
+            </w:r>
+          </w:p>
+        </w:tc>
+        <w:tc>
+          <w:tcPr>
+            <w:tcW w:type="dxa" w:w="4320"/>
+          </w:tcPr>
+          <w:p>
+            <w:r>
+              <w:t>{{ ann.box }}</w:t>
+            </w:r>
+          </w:p>
+        </w:tc>
+      </w:tr>
+      <w:tr>
+        <w:tc>
+          <w:tcPr>
+            <w:tcW w:type="dxa" w:w="4320"/>
+          </w:tcPr>
+          <w:p>
+            <w:r>
+              <w:t>最高温 (°C)</w:t>
+            </w:r>
+          </w:p>
+        </w:tc>
+        <w:tc>
+          <w:tcPr>
+            <w:tcW w:type="dxa" w:w="4320"/>
+          </w:tcPr>
+          <w:p>
+            <w:r>
+              <w:t>{{ ann.t_max }}</w:t>
+            </w:r>
+          </w:p>
+        </w:tc>
+      </w:tr>
+      <w:tr>
+        <w:tc>
+          <w:tcPr>
+            <w:tcW w:type="dxa" w:w="4320"/>
+          </w:tcPr>
+          <w:p>
+            <w:r>
+              <w:t>平均温 (°C)</w:t>
+            </w:r>
+          </w:p>
+        </w:tc>
+        <w:tc>
+          <w:tcPr>
+            <w:tcW w:type="dxa" w:w="4320"/>
+          </w:tcPr>
+          <w:p>
+            <w:r>
+              <w:t>{{ ann.t_mean }}</w:t>
+            </w:r>
+          </w:p>
+        </w:tc>
+      </w:tr>
+      <w:tr>
+        <w:tc>
+          <w:tcPr>
+            <w:tcW w:type="dxa" w:w="4320"/>
+          </w:tcPr>
+          <w:p>
+            <w:r>
+              <w:t>相对温差</w:t>
+            </w:r>
+          </w:p>
+        </w:tc>
+        <w:tc>
+          <w:tcPr>
+            <w:tcW w:type="dxa" w:w="4320"/>
+          </w:tcPr>
+          <w:p>
+            <w:r>
+              <w:t>{{ ann.relative_delta_pct }}</w:t>
+            </w:r>
+          </w:p>
+        </w:tc>
+      </w:tr>
+      <w:tr>
+        <w:tc>
+          <w:tcPr>
+            <w:tcW w:type="dxa" w:w="4320"/>
+          </w:tcPr>
+          <w:p>
+            <w:r>
+              <w:t>状态</w:t>
+            </w:r>
+          </w:p>
+        </w:tc>
+        <w:tc>
+          <w:tcPr>
+            <w:tcW w:type="dxa" w:w="4320"/>
+          </w:tcPr>
+          <w:p>
+            <w:r>
+              <w:t>{{ ann.status }}</w:t>
+            </w:r>
+          </w:p>
+        </w:tc>
+      </w:tr>
+    </w:tbl>
     <w:p>
       <w:r>
         <w:t>{% endfor %}</w:t>
       </w:r>
     </w:p>
+    <w:p/>
     <w:p>
       <w:r>
         <w:t>{% endfor %}</w:t>
+      </w:r>
+    </w:p>
+    <w:p/>
+    <w:p>
+      <w:r>
+        <w:t>公式说明: 相对温差 = (最高温 - 正常温度) / (最高温 - 环境温度) × 100%</w:t>
       </w:r>
     </w:p>
     <w:sectPr>

</xml_diff>